<commit_message>
Handbuch + Hilfe-KB: APPDOC-Codes dokumentiert (analog KorKI)
Abschnitt 3.9 (Erzeugen von APPDOC:<Dokument-ID>-Codes) und 3.9a (Öffnen
des verknüpften Archiv-Dokuments beim Scannen, nur innerhalb der App und
nur mit passender Bereichsfreigabe) sowie neuer FAQ-Eintrag ergänzt.
Handbuch-PDF ist anders als bei KorKI nicht volume-gemountet, sondern nur
als E-Mail-Anhang genutzt und ins Image gebacken (EmailService.js) -
Rebuild + Recreate statt reinem Datei-Kopieren nötig.

Zusätzlich einen neuen eigenständigen kb_hilfe-Eintrag "QR-/Barcode-Scanner"
angelegt (gab es auf FreiKI anders als auf KorKI noch nicht als separate
Quelle, nur eingebettet in die Handbuch-Kapitel) - selber Text wie auf
KorKI, war bereits markenneutral formuliert.

Co-Authored-By: Claude Sonnet 5 <noreply@anthropic.com>
</commit_message>
<xml_diff>
--- a/docs/FreiKI-Benutzerhandbuch.docx
+++ b/docs/FreiKI-Benutzerhandbuch.docx
@@ -80,7 +80,7 @@
           <w:sz w:val="21"/>
           <w:szCs w:val="21"/>
         </w:rPr>
-        <w:t xml:space="preserve">Version 0.7.4 · Stand: 11.08.2026</w:t>
+        <w:t xml:space="preserve">Version 0.7.4 · Stand: 12.08.2026</w:t>
       </w:r>
     </w:p>
     <w:tbl>
@@ -2066,6 +2066,29 @@
     </w:p>
     <w:p>
       <w:pPr>
+        <w:pStyle w:val="ListParagraph"/>
+        <w:numPr>
+          <w:ilvl w:val="0"/>
+          <w:numId w:val="2"/>
+        </w:numPr>
+        <w:spacing w:after="80"/>
+      </w:pPr>
+      <w:r>
+        <w:rPr>
+          <w:rFonts w:ascii="Calibri" w:cs="Calibri" w:eastAsia="Calibri" w:hAnsi="Calibri"/>
+          <w:b w:val="false"/>
+          <w:bCs w:val="false"/>
+          <w:i w:val="false"/>
+          <w:iCs w:val="false"/>
+          <w:color w:val="1F2937"/>
+          <w:sz w:val="21"/>
+          <w:szCs w:val="21"/>
+        </w:rPr>
+        <w:t xml:space="preserve">Format „APPDOC:&lt;Dokument-ID&gt;": erzeugt einen Code, der ein bestimmtes Dokument im Archiv öffnet (siehe 3.9a) – gedacht für Aufkleber, die auf interne Unterlagen wie Bedienungsanleitungen oder Pflegehinweise verweisen sollen</w:t>
+      </w:r>
+    </w:p>
+    <w:p>
+      <w:pPr>
         <w:spacing w:after="160"/>
       </w:pPr>
       <w:r>
@@ -2294,6 +2317,29 @@
           <w:szCs w:val="21"/>
         </w:rPr>
         <w:t xml:space="preserve">Sonstige Artikelcodes ohne feste Datenbank → Websuche mit einem Klick</w:t>
+      </w:r>
+    </w:p>
+    <w:p>
+      <w:pPr>
+        <w:pStyle w:val="ListParagraph"/>
+        <w:numPr>
+          <w:ilvl w:val="0"/>
+          <w:numId w:val="2"/>
+        </w:numPr>
+        <w:spacing w:after="80"/>
+      </w:pPr>
+      <w:r>
+        <w:rPr>
+          <w:rFonts w:ascii="Calibri" w:cs="Calibri" w:eastAsia="Calibri" w:hAnsi="Calibri"/>
+          <w:b w:val="false"/>
+          <w:bCs w:val="false"/>
+          <w:i w:val="false"/>
+          <w:iCs w:val="false"/>
+          <w:color w:val="1F2937"/>
+          <w:sz w:val="21"/>
+          <w:szCs w:val="21"/>
+        </w:rPr>
+        <w:t xml:space="preserve">Code im Format APPDOC:&lt;Dokument-ID&gt; → öffnet das verknüpfte Dokument direkt im Archiv; funktioniert nur innerhalb der App (nicht mit einer normalen Kamera-App) und nur für Nutzer mit passender Bereichsfreigabe</w:t>
       </w:r>
     </w:p>
     <w:tbl>
@@ -4934,6 +4980,42 @@
           <w:sz w:val="21"/>
           <w:szCs w:val="21"/>
         </w:rPr>
+        <w:t xml:space="preserve">Was ist ein APPDOC-Code?</w:t>
+      </w:r>
+    </w:p>
+    <w:p>
+      <w:pPr>
+        <w:spacing w:after="160"/>
+      </w:pPr>
+      <w:r>
+        <w:rPr>
+          <w:rFonts w:ascii="Calibri" w:cs="Calibri" w:eastAsia="Calibri" w:hAnsi="Calibri"/>
+          <w:b w:val="false"/>
+          <w:bCs w:val="false"/>
+          <w:i w:val="false"/>
+          <w:iCs w:val="false"/>
+          <w:color w:val="1F2937"/>
+          <w:sz w:val="21"/>
+          <w:szCs w:val="21"/>
+        </w:rPr>
+        <w:t xml:space="preserve">Ein QR-Code im Format APPDOC:&lt;Dokument-ID&gt;, der auf ein bestimmtes Dokument im Archiv verweist – z. B. für Aufkleber an Geräten oder Räumen, die auf eine Anleitung oder Pflegehinweise zeigen sollen. Erzeugt wird er im Werkzeug „QR-Code erstellen", geöffnet nur innerhalb der App über den QR-/Barcode-Scanner und nur für Nutzer mit passender Bereichsfreigabe sichtbar.</w:t>
+      </w:r>
+    </w:p>
+    <w:p>
+      <w:pPr>
+        <w:spacing w:after="40"/>
+      </w:pPr>
+      <w:r>
+        <w:rPr>
+          <w:rFonts w:ascii="Calibri" w:cs="Calibri" w:eastAsia="Calibri" w:hAnsi="Calibri"/>
+          <w:b/>
+          <w:bCs/>
+          <w:i w:val="false"/>
+          <w:iCs w:val="false"/>
+          <w:color w:val="1F2937"/>
+          <w:sz w:val="21"/>
+          <w:szCs w:val="21"/>
+        </w:rPr>
         <w:t xml:space="preserve">Kann ich mich per Face ID oder Fingerabdruck anmelden?</w:t>
       </w:r>
     </w:p>

</xml_diff>